<commit_message>
Clarify 89-item paper wording
</commit_message>
<xml_diff>
--- a/paper/main.docx
+++ b/paper/main.docx
@@ -881,7 +881,7 @@
         <w:t xml:space="preserve"> </w:t>
       </w:r>
       <w:r>
-        <w:t xml:space="preserve">modifying task logic. Third, it reports an 89-item local pilot with complete</w:t>
+        <w:t xml:space="preserve">modifying task logic. Third, it reports an 89-item-per-task local pilot with complete</w:t>
       </w:r>
       <w:r>
         <w:t xml:space="preserve"> </w:t>
@@ -4088,7 +4088,7 @@
         <w:t xml:space="preserve"> </w:t>
       </w:r>
       <w:r>
-        <w:t xml:space="preserve">tag was installed locally through Ollama for the 89-item run.</w:t>
+        <w:t xml:space="preserve">tag was installed locally through Ollama for the 89-item-per-task run.</w:t>
       </w:r>
     </w:p>
     <w:p>
@@ -4096,7 +4096,7 @@
         <w:pStyle w:val="BodyText"/>
       </w:pPr>
       <w:r>
-        <w:t xml:space="preserve">After the primary 89-item run, we pulled additional local Ollama tags:</w:t>
+        <w:t xml:space="preserve">After the primary 89-item-per-task run, we pulled additional local Ollama tags:</w:t>
       </w:r>
       <w:r>
         <w:t xml:space="preserve"> </w:t>
@@ -4456,7 +4456,7 @@
         <w:pStyle w:val="FirstParagraph"/>
       </w:pPr>
       <w:r>
-        <w:t xml:space="preserve">This section reports the 89-item run. The complete raw logs are in</w:t>
+        <w:t xml:space="preserve">This section reports the 89-item-per-task run. The complete raw logs are in</w:t>
       </w:r>
       <w:r>
         <w:t xml:space="preserve"> </w:t>
@@ -4566,7 +4566,7 @@
         <w:pStyle w:val="ImageCaption"/>
       </w:pPr>
       <w:r>
-        <w:t xml:space="preserve">Quality and budget-violation curves for the 89-item pilot run. SWE quality is the patch-similarity proxy; LongBench v2 quality is exact-match accuracy.</w:t>
+        <w:t xml:space="preserve">Quality and budget-violation curves for the 89-item-per-task pilot run. SWE quality is the patch-similarity proxy; LongBench v2 quality is exact-match accuracy.</w:t>
       </w:r>
     </w:p>
     <w:bookmarkEnd w:id="40"/>
@@ -4698,7 +4698,7 @@
         <w:pStyle w:val="FirstParagraph"/>
       </w:pPr>
       <w:r>
-        <w:t xml:space="preserve">The initial 89-item pilot does not answer whether a budgeted strategy can</w:t>
+        <w:t xml:space="preserve">The initial 89-item-per-task pilot does not answer whether a budgeted strategy can</w:t>
       </w:r>
       <w:r>
         <w:t xml:space="preserve"> </w:t>
@@ -10663,7 +10663,7 @@
         <w:t xml:space="preserve"> </w:t>
       </w:r>
       <w:r>
-        <w:t xml:space="preserve">small-model sweep. This is not a ranking comparison with the 89-item run: it</w:t>
+        <w:t xml:space="preserve">small-model sweep. This is not a ranking comparison with the 89-item-per-task run: it</w:t>
       </w:r>
       <w:r>
         <w:t xml:space="preserve"> </w:t>
@@ -12292,7 +12292,7 @@
         <w:t xml:space="preserve"> </w:t>
       </w:r>
       <w:r>
-        <w:t xml:space="preserve">latency when active context is fixed? The expanded 89-item pilot run and the</w:t>
+        <w:t xml:space="preserve">latency when active context is fixed? The expanded 89-item-per-task pilot run and the</w:t>
       </w:r>
       <w:r>
         <w:t xml:space="preserve"> </w:t>
@@ -14229,7 +14229,7 @@
         <w:t xml:space="preserve"> </w:t>
       </w:r>
       <w:r>
-        <w:t xml:space="preserve">unchanged. It is not a memory policy and is not included in the 89-item pilot</w:t>
+        <w:t xml:space="preserve">unchanged. It is not a memory policy and is not included in the 89-item-per-task pilot</w:t>
       </w:r>
       <w:r>
         <w:t xml:space="preserve"> </w:t>
@@ -15035,7 +15035,7 @@
         <w:pStyle w:val="TableCaption"/>
       </w:pPr>
       <w:r>
-        <w:t xml:space="preserve">Full quality matrix for the 89-item run. LongBench v2 values are exact-match accuracy. SWE values are patch-similarity proxy scores and are not official SWE-bench accuracy.</w:t>
+        <w:t xml:space="preserve">Full quality matrix for the 89-item-per-task run. LongBench v2 values are exact-match accuracy. SWE values are patch-similarity proxy scores and are not official SWE-bench accuracy.</w:t>
       </w:r>
     </w:p>
     <w:tbl>
@@ -15043,7 +15043,7 @@
         <w:tblStyle w:val="Table"/>
         <w:tblW w:type="auto" w:w="0"/>
         <w:tblLook w:firstRow="1" w:lastRow="0" w:firstColumn="0" w:lastColumn="0" w:noHBand="0" w:noVBand="0" w:val="0020"/>
-        <w:tblCaption w:val="Full quality matrix for the 89-item run. LongBench v2 values are exact-match accuracy. SWE values are patch-similarity proxy scores and are not official SWE-bench accuracy."/>
+        <w:tblCaption w:val="Full quality matrix for the 89-item-per-task run. LongBench v2 values are exact-match accuracy. SWE values are patch-similarity proxy scores and are not official SWE-bench accuracy."/>
       </w:tblPr>
       <w:tblGrid>
         <w:gridCol w:w="1131"/>
@@ -15659,7 +15659,7 @@
         <w:pStyle w:val="TableCaption"/>
       </w:pPr>
       <w:r>
-        <w:t xml:space="preserve">Full budget-violation matrix for the 89-item run.</w:t>
+        <w:t xml:space="preserve">Full budget-violation matrix for the 89-item-per-task run.</w:t>
       </w:r>
     </w:p>
     <w:tbl>
@@ -15667,7 +15667,7 @@
         <w:tblStyle w:val="Table"/>
         <w:tblW w:type="auto" w:w="0"/>
         <w:tblLook w:firstRow="1" w:lastRow="0" w:firstColumn="0" w:lastColumn="0" w:noHBand="0" w:noVBand="0" w:val="0020"/>
-        <w:tblCaption w:val="Full budget-violation matrix for the 89-item run."/>
+        <w:tblCaption w:val="Full budget-violation matrix for the 89-item-per-task run."/>
       </w:tblPr>
       <w:tblGrid>
         <w:gridCol w:w="1131"/>
@@ -22352,7 +22352,7 @@
         <w:t xml:space="preserve"> </w:t>
       </w:r>
       <w:r>
-        <w:t xml:space="preserve">single 89-item run is still an artifact-validation study rather than a powered</w:t>
+        <w:t xml:space="preserve">single 89-item-per-task run is still an artifact-validation study rather than a powered</w:t>
       </w:r>
       <w:r>
         <w:t xml:space="preserve"> </w:t>
@@ -22500,7 +22500,7 @@
         <w:t xml:space="preserve"> </w:t>
       </w:r>
       <w:r>
-        <w:t xml:space="preserve">89-item run is enough to exercise the full matrix and reduce coarse rounding</w:t>
+        <w:t xml:space="preserve">89-item-per-task run is enough to exercise the full matrix and reduce coarse rounding</w:t>
       </w:r>
       <w:r>
         <w:t xml:space="preserve"> </w:t>
@@ -23432,7 +23432,7 @@
         <w:t xml:space="preserve"> </w:t>
       </w:r>
       <w:r>
-        <w:t xml:space="preserve">89-item pilot is an example: the 8K budget has the highest RAG score. The</w:t>
+        <w:t xml:space="preserve">89-item-per-task pilot is an example: the 8K budget has the highest RAG score. The</w:t>
       </w:r>
       <w:r>
         <w:t xml:space="preserve"> </w:t>

</xml_diff>